<commit_message>
v6: exclude 371 species with IUCN ranges outside US EEZ; fix missing mammal range maps
- Exclude 371 species (343 fish, 20 invertebrates, 6 corals, 2 mammals)
  whose IUCN expert range maps fall entirely outside the US EEZ. Their
  AquaMaps predictions in US waters were edge-of-range artifacts with
  near-zero suitability. Valid species: 9,819 → 9,424.
- Ingest 3 missing mammal IUCN ranges (Phoca vitulina, Trichechus manatus,
  Pusa hispida) from newer MAMMALS.zip download.
- Fix merge cleanup bug: delete stale merged models before the zero-cells
  check, not after.
- Resolves all 12 SEFSC-flagged marine mammals in Gulf of America.
- Score impact negligible across all Program Areas.

Co-Authored-By: Claude Opus 4.6 (1M context) <noreply@anthropic.com>
</commit_message>
<xml_diff>
--- a/figs/msens-summary_programareas_v4b/table_ecoregion_programarea_scores_v4b.docx
+++ b/figs/msens-summary_programareas_v4b/table_ecoregion_programarea_scores_v4b.docx
@@ -1652,7 +1652,7 @@
                 <w:szCs w:val="20"/>
                 <w:color w:val="000000"/>
               </w:rPr>
-              <w:t xml:space="preserve">13</w:t>
+              <w:t xml:space="preserve">12</w:t>
             </w:r>
           </w:p>
         </w:tc>
@@ -1922,7 +1922,7 @@
                 <w:szCs w:val="20"/>
                 <w:color w:val="000000"/>
               </w:rPr>
-              <w:t xml:space="preserve">20</w:t>
+              <w:t xml:space="preserve">19</w:t>
             </w:r>
           </w:p>
         </w:tc>
@@ -4390,7 +4390,7 @@
                 <w:szCs w:val="20"/>
                 <w:color w:val="000000"/>
               </w:rPr>
-              <w:t xml:space="preserve">30</w:t>
+              <w:t xml:space="preserve">29</w:t>
             </w:r>
           </w:p>
         </w:tc>
@@ -5338,7 +5338,7 @@
                 <w:szCs w:val="20"/>
                 <w:color w:val="000000"/>
               </w:rPr>
-              <w:t xml:space="preserve">53</w:t>
+              <w:t xml:space="preserve">52</w:t>
             </w:r>
           </w:p>
         </w:tc>
@@ -5746,7 +5746,7 @@
                 <w:szCs w:val="20"/>
                 <w:color w:val="000000"/>
               </w:rPr>
-              <w:t xml:space="preserve">19</w:t>
+              <w:t xml:space="preserve">18</w:t>
             </w:r>
           </w:p>
         </w:tc>
@@ -6016,7 +6016,7 @@
                 <w:szCs w:val="20"/>
                 <w:color w:val="000000"/>
               </w:rPr>
-              <w:t xml:space="preserve">58</w:t>
+              <w:t xml:space="preserve">57</w:t>
             </w:r>
           </w:p>
         </w:tc>
@@ -6694,7 +6694,7 @@
                 <w:szCs w:val="20"/>
                 <w:color w:val="000000"/>
               </w:rPr>
-              <w:t xml:space="preserve">67</w:t>
+              <w:t xml:space="preserve">69</w:t>
             </w:r>
           </w:p>
         </w:tc>
@@ -7102,7 +7102,7 @@
                 <w:szCs w:val="20"/>
                 <w:color w:val="000000"/>
               </w:rPr>
-              <w:t xml:space="preserve">28</w:t>
+              <w:t xml:space="preserve">29</w:t>
             </w:r>
           </w:p>
         </w:tc>
@@ -7372,7 +7372,7 @@
                 <w:szCs w:val="20"/>
                 <w:color w:val="000000"/>
               </w:rPr>
-              <w:t xml:space="preserve">50</w:t>
+              <w:t xml:space="preserve">52</w:t>
             </w:r>
           </w:p>
         </w:tc>
@@ -7780,7 +7780,7 @@
                 <w:szCs w:val="20"/>
                 <w:color w:val="000000"/>
               </w:rPr>
-              <w:t xml:space="preserve">41</w:t>
+              <w:t xml:space="preserve">39</w:t>
             </w:r>
           </w:p>
         </w:tc>
@@ -8050,7 +8050,7 @@
                 <w:szCs w:val="20"/>
                 <w:color w:val="000000"/>
               </w:rPr>
-              <w:t xml:space="preserve">73</w:t>
+              <w:t xml:space="preserve">74</w:t>
             </w:r>
           </w:p>
         </w:tc>
@@ -8432,7 +8432,7 @@
                 <w:szCs w:val="20"/>
                 <w:color w:val="000000"/>
               </w:rPr>
-              <w:t xml:space="preserve">24</w:t>
+              <w:t xml:space="preserve">25</w:t>
             </w:r>
           </w:p>
         </w:tc>
@@ -8702,7 +8702,7 @@
                 <w:szCs w:val="20"/>
                 <w:color w:val="000000"/>
               </w:rPr>
-              <w:t xml:space="preserve">44</w:t>
+              <w:t xml:space="preserve">47</w:t>
             </w:r>
           </w:p>
         </w:tc>
@@ -9814,7 +9814,7 @@
                 <w:szCs w:val="20"/>
                 <w:color w:val="000000"/>
               </w:rPr>
-              <w:t xml:space="preserve">52</w:t>
+              <w:t xml:space="preserve">53</w:t>
             </w:r>
           </w:p>
         </w:tc>
@@ -10084,7 +10084,7 @@
                 <w:szCs w:val="20"/>
                 <w:color w:val="000000"/>
               </w:rPr>
-              <w:t xml:space="preserve">69</w:t>
+              <w:t xml:space="preserve">73</w:t>
             </w:r>
           </w:p>
         </w:tc>
@@ -13178,7 +13178,7 @@
                 <w:szCs w:val="20"/>
                 <w:color w:val="000000"/>
               </w:rPr>
-              <w:t xml:space="preserve">11</w:t>
+              <w:t xml:space="preserve">10</w:t>
             </w:r>
           </w:p>
         </w:tc>
@@ -14986,7 +14986,7 @@
                 <w:szCs w:val="20"/>
                 <w:color w:val="000000"/>
               </w:rPr>
-              <w:t xml:space="preserve">40</w:t>
+              <w:t xml:space="preserve">38</w:t>
             </w:r>
           </w:p>
         </w:tc>
@@ -17306,7 +17306,7 @@
                 <w:szCs w:val="20"/>
                 <w:color w:val="000000"/>
               </w:rPr>
-              <w:t xml:space="preserve">40</w:t>
+              <w:t xml:space="preserve">38</w:t>
             </w:r>
           </w:p>
         </w:tc>
@@ -19340,7 +19340,7 @@
                 <w:szCs w:val="20"/>
                 <w:color w:val="000000"/>
               </w:rPr>
-              <w:t xml:space="preserve">61</w:t>
+              <w:t xml:space="preserve">60</w:t>
             </w:r>
           </w:p>
         </w:tc>
@@ -19748,7 +19748,7 @@
                 <w:szCs w:val="20"/>
                 <w:color w:val="000000"/>
               </w:rPr>
-              <w:t xml:space="preserve">29</w:t>
+              <w:t xml:space="preserve">30</w:t>
             </w:r>
           </w:p>
         </w:tc>

</xml_diff>